<commit_message>
resume-builder: ensure header.title in target resume; update renderer and kernelspec to ai_py312
</commit_message>
<xml_diff>
--- a/notebooks/resume-builder/artifacts/douglas_daly_principal_ai_engineer_v1.docx
+++ b/notebooks/resume-builder/artifacts/douglas_daly_principal_ai_engineer_v1.docx
@@ -38,7 +38,7 @@
           <w:b/>
           <w:sz w:val="20"/>
         </w:rPr>
-        <w:t>Principal AI Engineer / AI Solutions Architect</w:t>
+        <w:t>Principal AI Architect / AI Platform Engineering Lead</w:t>
       </w:r>
     </w:p>
     <w:p>
@@ -65,35 +65,7 @@
           <w:b w:val="0"/>
           <w:sz w:val="17"/>
         </w:rPr>
-        <w:t>• Principal AI Engineer and technical leader with 20+ years building enterprise decision systems, operational intelligence platforms, and production AI solutions.</w:t>
-      </w:r>
-    </w:p>
-    <w:p>
-      <w:pPr>
-        <w:spacing w:after="30"/>
-        <w:ind w:left="230" w:hanging="230"/>
-      </w:pPr>
-      <w:r>
-        <w:rPr>
-          <w:rFonts w:ascii="Arial" w:hAnsi="Arial" w:eastAsia="Arial"/>
-          <w:b w:val="0"/>
-          <w:sz w:val="17"/>
-        </w:rPr>
-        <w:t>• Hands-on experience with RAG, agentic AI, tool orchestration, graph analytics, BigQuery, GCP, AWS, and Python.</w:t>
-      </w:r>
-    </w:p>
-    <w:p>
-      <w:pPr>
-        <w:spacing w:after="30"/>
-        <w:ind w:left="230" w:hanging="230"/>
-      </w:pPr>
-      <w:r>
-        <w:rPr>
-          <w:rFonts w:ascii="Arial" w:hAnsi="Arial" w:eastAsia="Arial"/>
-          <w:b w:val="0"/>
-          <w:sz w:val="17"/>
-        </w:rPr>
-        <w:t>• Deep background in observability, reliability, AI governance, and cross-functional technical leadership across utilities, financial services, media, retail, telecommunications, and aerospace/defense.</w:t>
+        <w:t>• Senior technical leader with deep expertise architecting enterprise AI/ML platforms, governed GenAI and tool-calling systems, and operational intelligence solutions. Built governed analytics assistants, monitoring frameworks, and reusable data/AI platforms with strong emphasis on controls, observability, and auditable execution. Experienced across cloud-native AI infrastructure, large-scale data platforms, executive alignment, and technical mentorship. Known for translating ambiguous business needs into scalable, reliable analytical systems that improve decision-making and operational performance.</w:t>
       </w:r>
     </w:p>
     <w:p>
@@ -116,7 +88,7 @@
           <w:b w:val="0"/>
           <w:sz w:val="17"/>
         </w:rPr>
-        <w:t>AI Architecture | Production AI Systems | Agentic AI | RAG | Enterprise Integration | Operational Intelligence | Observability | MLOps | Graph Analytics</w:t>
+        <w:t>AI Platform Architecture - enterprise AI platforms, governed analytics assistants, operational intelligence systems, reusable AI/analytics frameworks | GenAI &amp; Tool-Calling Systems - LLM applications, structured outputs, tool orchestration, RAG/GraphRAG concepts, prompt engineering, evaluation, traceability | Governance &amp; Operational Controls - responsible AI adoption, guardrails, auditable execution, analyst-in-the-loop workflows, policy-aware system design | Observability &amp; Reliability - monitoring frameworks, incident detection, alerting, operational health, SLIs/SLOs, SEV analysis, on-call-friendly design | Cloud &amp; Data Platforms - Python, SQL, BigQuery, AWS SageMaker/S3/Terraform, GCP, Docker, data profiling, validation, cross-system integration | Technical Leadership - architecture direction, executive alignment, technical roadmaps, stakeholder translation, mentoring, developer enablement</w:t>
       </w:r>
     </w:p>
     <w:p>
@@ -139,7 +111,6 @@
           <w:b w:val="0"/>
           <w:sz w:val="16"/>
         </w:rPr>
-        <w:t>Python | SQL | BigQuery | GCP | AWS | Gemini | LangGraph | MCP | SageMaker | Terraform | S3 | Neptune | GraphStorm | Bedrock | Kafka | Elastic Stack | Splunk</w:t>
       </w:r>
     </w:p>
     <w:p>
@@ -187,7 +158,7 @@
           <w:b w:val="0"/>
           <w:sz w:val="17"/>
         </w:rPr>
-        <w:t>• Led analytical readiness assessment for Oracle/EBS and Maximo data migrated to BigQuery, establishing cross-domain enterprise data integration for construction operations and financial analytics at Consolidated Edison.</w:t>
+        <w:t>• Built a governed analytics assistant leveraging Gemini, BigQuery, and tool-calling architectures, applying analyst rules and operational controls to ensure predictable, auditable, and compliant execution of generative AI workflows.</w:t>
       </w:r>
     </w:p>
     <w:p>
@@ -201,7 +172,7 @@
           <w:b w:val="0"/>
           <w:sz w:val="17"/>
         </w:rPr>
-        <w:t>• Developed automated data profiling, type inference, duplicate detection, candidate key analysis, and cross-system join validation frameworks across 100+ source tables with millions of operational and financial records.</w:t>
+        <w:t>• Developed automated frameworks for profiling, type inference, duplicate detection, candidate key analysis, and cross-system join validation across 100+ source tables and millions of operational and financial records, enhancing data quality and interoperability.</w:t>
       </w:r>
     </w:p>
     <w:p>
@@ -215,7 +186,7 @@
           <w:b w:val="0"/>
           <w:sz w:val="17"/>
         </w:rPr>
-        <w:t>• Created a phased analytical maturity roadmap adopted as the foundation for anomaly detection, construction analytics, and AI-enabled decision support initiatives.</w:t>
+        <w:t>• Defined a phased analytical maturity roadmap adopted as the foundation for anomaly detection, construction analytics, and AI-enabled decision support initiatives.</w:t>
       </w:r>
     </w:p>
     <w:p>
@@ -229,28 +200,7 @@
           <w:b w:val="0"/>
           <w:sz w:val="17"/>
         </w:rPr>
-        <w:t>• Architected and implemented a governed analytics assistant leveraging Gemini, BigQuery, and tool-calling architectures to enforce analyst rules and operational controls with predictable, auditable execution.</w:t>
-      </w:r>
-    </w:p>
-    <w:p>
-      <w:pPr>
-        <w:spacing w:before="60" w:after="20"/>
-      </w:pPr>
-      <w:r>
-        <w:rPr>
-          <w:rFonts w:ascii="Arial" w:hAnsi="Arial" w:eastAsia="Arial"/>
-          <w:b/>
-          <w:sz w:val="18"/>
-        </w:rPr>
-        <w:t>Principal Consultant</w:t>
-      </w:r>
-      <w:r>
-        <w:rPr>
-          <w:rFonts w:ascii="Arial" w:hAnsi="Arial" w:eastAsia="Arial"/>
-          <w:b w:val="0"/>
-          <w:sz w:val="17"/>
-        </w:rPr>
-        <w:t xml:space="preserve"> | Apex Systems / NBCUniversal | Jan 2026 - Present</w:t>
+        <w:t>• Led analytical readiness assessment for Oracle/EBS and Maximo data migration to BigQuery, establishing the basis for cross-domain analytics across construction operations and financial systems.</w:t>
       </w:r>
     </w:p>
     <w:p>
@@ -264,7 +214,7 @@
           <w:b w:val="0"/>
           <w:sz w:val="17"/>
         </w:rPr>
-        <w:t>• Built AWS-based AI and graph analytics pipelines using SageMaker, Terraform, S3, and containerized workloads to support NBCUniversal's digital twin initiatives.</w:t>
+        <w:t>• Architected AWS-based AI and graph analytics pipelines leveraging SageMaker, Terraform, S3, and containerized workloads to enable scalable, cloud-native ML workflows.</w:t>
       </w:r>
     </w:p>
     <w:p>
@@ -278,7 +228,7 @@
           <w:b w:val="0"/>
           <w:sz w:val="17"/>
         </w:rPr>
-        <w:t>• Developed graph-ready service dependency datasets from API telemetry and operational metrics, enabling graph-based dependency modeling and operational intelligence.</w:t>
+        <w:t>• Evaluated and integrated emerging graph analytics and graph machine learning technologies—including Neptune, GraphStorm, Bedrock, and LangGraph—for advanced dependency analysis and operational intelligence use cases.</w:t>
       </w:r>
     </w:p>
     <w:p>
@@ -299,7 +249,7 @@
           <w:b w:val="0"/>
           <w:sz w:val="17"/>
         </w:rPr>
-        <w:t xml:space="preserve"> | SimpliLearn &amp; Interview Kickstart | 2025 - Present</w:t>
+        <w:t xml:space="preserve"> | SimpliLearn | October 2025 - Present</w:t>
       </w:r>
     </w:p>
     <w:p>
@@ -313,7 +263,7 @@
           <w:b w:val="0"/>
           <w:sz w:val="17"/>
         </w:rPr>
-        <w:t>• Delivered professional training on LLMs, RAG, agentic AI, MCP, diffusion models, CLIP, and modern generative AI architectures to software engineers and technical professionals.</w:t>
+        <w:t>• Mentored students on AI architecture, governance, implementation tradeoffs, and enterprise adoption strategies, fostering cross-functional technical leadership and responsible AI practices.</w:t>
       </w:r>
     </w:p>
     <w:p>
@@ -327,7 +277,56 @@
           <w:b w:val="0"/>
           <w:sz w:val="17"/>
         </w:rPr>
-        <w:t>• Developed hands-on demonstrations, Jupyter notebooks, and end-to-end applications covering modern AI workflows, evaluation techniques, and production deployment considerations.</w:t>
+        <w:t>• Delivered instruction on transformer architectures, LLMs, RAG, agentic and multimodal AI, diffusion models, and enterprise AI governance, enabling talent development in advanced generative and agentic AI technologies.</w:t>
+      </w:r>
+    </w:p>
+    <w:p>
+      <w:pPr>
+        <w:spacing w:before="60" w:after="20"/>
+      </w:pPr>
+      <w:r>
+        <w:rPr>
+          <w:rFonts w:ascii="Arial" w:hAnsi="Arial" w:eastAsia="Arial"/>
+          <w:b/>
+          <w:sz w:val="18"/>
+        </w:rPr>
+        <w:t>AI Instructor</w:t>
+      </w:r>
+      <w:r>
+        <w:rPr>
+          <w:rFonts w:ascii="Arial" w:hAnsi="Arial" w:eastAsia="Arial"/>
+          <w:b w:val="0"/>
+          <w:sz w:val="17"/>
+        </w:rPr>
+        <w:t xml:space="preserve"> | Interview Kickstart | March 2025 - Present</w:t>
+      </w:r>
+    </w:p>
+    <w:p>
+      <w:pPr>
+        <w:spacing w:after="30"/>
+        <w:ind w:left="230" w:hanging="230"/>
+      </w:pPr>
+      <w:r>
+        <w:rPr>
+          <w:rFonts w:ascii="Arial" w:hAnsi="Arial" w:eastAsia="Arial"/>
+          <w:b w:val="0"/>
+          <w:sz w:val="17"/>
+        </w:rPr>
+        <w:t>• Mentored students on AI architecture, implementation patterns, and technology selection tradeoffs, fostering technical fluency and cross-team knowledge sharing.</w:t>
+      </w:r>
+    </w:p>
+    <w:p>
+      <w:pPr>
+        <w:spacing w:after="30"/>
+        <w:ind w:left="230" w:hanging="230"/>
+      </w:pPr>
+      <w:r>
+        <w:rPr>
+          <w:rFonts w:ascii="Arial" w:hAnsi="Arial" w:eastAsia="Arial"/>
+          <w:b w:val="0"/>
+          <w:sz w:val="17"/>
+        </w:rPr>
+        <w:t>• Delivered instruction on practical applications of LLMs, RAG, agentic AI, and modern AI development workflows, enabling talent development in advanced AI technologies.</w:t>
       </w:r>
     </w:p>
     <w:p>
@@ -348,7 +347,7 @@
           <w:b w:val="0"/>
           <w:sz w:val="17"/>
         </w:rPr>
-        <w:t xml:space="preserve"> | Meta | Oct 2021 - Jan 2025</w:t>
+        <w:t xml:space="preserve"> | Intuit (via The Cydio Group) | Apr 2025 - Jul 2025</w:t>
       </w:r>
     </w:p>
     <w:p>
@@ -362,7 +361,7 @@
           <w:b w:val="0"/>
           <w:sz w:val="17"/>
         </w:rPr>
-        <w:t>• Developed reliability measurement and forecasting frameworks for Meta FinTech, defining leading indicators and decision-support models that translated engineering initiatives into projected reliability outcomes for planning, prioritization, and performance management.</w:t>
+        <w:t>• Partnered with finance, marketing, and product stakeholders to translate attribution and performance data into actionable business recommendations, driving alignment between business objectives and technical solutions.</w:t>
       </w:r>
     </w:p>
     <w:p>
@@ -376,21 +375,7 @@
           <w:b w:val="0"/>
           <w:sz w:val="17"/>
         </w:rPr>
-        <w:t>• Built attribution frameworks linking incidents, alerts, defects, and operational metrics to engineering organizations and service ownership, enabling accurate accountability and observability.</w:t>
-      </w:r>
-    </w:p>
-    <w:p>
-      <w:pPr>
-        <w:spacing w:after="30"/>
-        <w:ind w:left="230" w:hanging="230"/>
-      </w:pPr>
-      <w:r>
-        <w:rPr>
-          <w:rFonts w:ascii="Arial" w:hAnsi="Arial" w:eastAsia="Arial"/>
-          <w:b w:val="0"/>
-          <w:sz w:val="17"/>
-        </w:rPr>
-        <w:t>• Designed and developed the ReMon framework, enabling engineering teams to build comprehensive monitoring and alerting systems without requiring expertise in complex internal tooling; adopted across Meta FinTech and contributed to automatic detection of over 15 SEVs in 2024.</w:t>
+        <w:t>• Consolidated fragmented reporting into unified Tableau dashboards and automated executive reporting workflows using Python and SQL, reducing report preparation time from days to hours and enhancing data integration and process efficiency.</w:t>
       </w:r>
     </w:p>
     <w:p>
@@ -411,7 +396,7 @@
           <w:b w:val="0"/>
           <w:sz w:val="17"/>
         </w:rPr>
-        <w:t xml:space="preserve"> | Samsung Electronics | Dec 2020 - Oct 2021</w:t>
+        <w:t xml:space="preserve"> | Meta | October 2021 - January 2025</w:t>
       </w:r>
     </w:p>
     <w:p>
@@ -425,7 +410,56 @@
           <w:b w:val="0"/>
           <w:sz w:val="17"/>
         </w:rPr>
-        <w:t>• Developed gradient-boosting propensity models and automated audience-segmentation workflows for digital marketing campaigns, increasing conversions by 146% and campaign-attributed revenue by 229%.</w:t>
+        <w:t>• Designed and developed the ReMon framework, empowering engineering teams to implement robust monitoring and alerting systems without deep internal tooling expertise; widely adopted across Meta FinTech and instrumental in the automatic detection of over 15 SEVs in 2024.</w:t>
+      </w:r>
+    </w:p>
+    <w:p>
+      <w:pPr>
+        <w:spacing w:after="30"/>
+        <w:ind w:left="230" w:hanging="230"/>
+      </w:pPr>
+      <w:r>
+        <w:rPr>
+          <w:rFonts w:ascii="Arial" w:hAnsi="Arial" w:eastAsia="Arial"/>
+          <w:b w:val="0"/>
+          <w:sz w:val="17"/>
+        </w:rPr>
+        <w:t>• Developed forecasting and performance-management frameworks that translated engineering initiatives into projected reliability outcomes, supporting planning, goal setting, and leadership decision-making across multiple business pillars.</w:t>
+      </w:r>
+    </w:p>
+    <w:p>
+      <w:pPr>
+        <w:spacing w:before="60" w:after="20"/>
+      </w:pPr>
+      <w:r>
+        <w:rPr>
+          <w:rFonts w:ascii="Arial" w:hAnsi="Arial" w:eastAsia="Arial"/>
+          <w:b/>
+          <w:sz w:val="18"/>
+        </w:rPr>
+        <w:t>Data Scientist</w:t>
+      </w:r>
+      <w:r>
+        <w:rPr>
+          <w:rFonts w:ascii="Arial" w:hAnsi="Arial" w:eastAsia="Arial"/>
+          <w:b w:val="0"/>
+          <w:sz w:val="17"/>
+        </w:rPr>
+        <w:t xml:space="preserve"> | Samsung Electronics (via Harvey Nash) | Dec 2020 - Oct 2021</w:t>
+      </w:r>
+    </w:p>
+    <w:p>
+      <w:pPr>
+        <w:spacing w:after="30"/>
+        <w:ind w:left="230" w:hanging="230"/>
+      </w:pPr>
+      <w:r>
+        <w:rPr>
+          <w:rFonts w:ascii="Arial" w:hAnsi="Arial" w:eastAsia="Arial"/>
+          <w:b w:val="0"/>
+          <w:sz w:val="17"/>
+        </w:rPr>
+        <w:t>• Developed and deployed gradient-boosting propensity models and automated audience segmentation workflows, driving a 146% increase in campaign conversions and a 229% rise in campaign-attributed revenue while improving efficiency and scalability of digital marketing initiatives.</w:t>
       </w:r>
     </w:p>
     <w:p>
@@ -460,7 +494,28 @@
           <w:b w:val="0"/>
           <w:sz w:val="17"/>
         </w:rPr>
-        <w:t>• Led development of market-intelligence products on a 30B+ transaction dataset, transforming raw payment-card activity into merchant, industry, and consumer-behavior intelligence used for competitive analysis and strategic decision-making.</w:t>
+        <w:t>• Led data science initiatives on a 30B+ transaction dataset, architecting analytical products and market-intelligence capabilities through large-scale feature engineering, merchant intelligence, and consumer-spending analytics.</w:t>
+      </w:r>
+    </w:p>
+    <w:p>
+      <w:pPr>
+        <w:spacing w:before="60" w:after="20"/>
+      </w:pPr>
+      <w:r>
+        <w:rPr>
+          <w:rFonts w:ascii="Arial" w:hAnsi="Arial" w:eastAsia="Arial"/>
+          <w:b/>
+          <w:sz w:val="18"/>
+        </w:rPr>
+        <w:t>Expert SEO Solutions Architect</w:t>
+      </w:r>
+      <w:r>
+        <w:rPr>
+          <w:rFonts w:ascii="Arial" w:hAnsi="Arial" w:eastAsia="Arial"/>
+          <w:b w:val="0"/>
+          <w:sz w:val="17"/>
+        </w:rPr>
+        <w:t xml:space="preserve"> | Nike (via Intersoft Inc.) | Nov 2016 - Sep 2017</w:t>
       </w:r>
     </w:p>
     <w:p>
@@ -474,7 +529,7 @@
           <w:b w:val="0"/>
           <w:sz w:val="17"/>
         </w:rPr>
-        <w:t>• Built large-scale entity-resolution systems that transformed billions of cryptic payment-card transactions into structured merchant, brand, industry, and storefront intelligence, enabling analytics across 2,500+ merchants representing more than 60% of observed card transactions and achieving over 99% transaction coverage.</w:t>
+        <w:t>• Architected a scalable SEO and information-architecture framework for Nike's product discovery platform, aligning customer navigation with search engine indexation to support a rapidly growing product catalog.</w:t>
       </w:r>
     </w:p>
     <w:p>
@@ -509,7 +564,7 @@
           <w:b w:val="0"/>
           <w:sz w:val="17"/>
         </w:rPr>
-        <w:t>• Developed predictive capacity-management models forecasting peak-demand scenarios for customer-facing banking platforms, supporting infrastructure planning, resiliency investments, and operational risk management.</w:t>
+        <w:t>• Conceived, architected, and led adoption of RITHM, an operational intelligence platform aggregating real-time monitoring signals by business capability and system ownership, reducing major incident detection times from hours to minutes.</w:t>
       </w:r>
     </w:p>
     <w:p>
@@ -523,7 +578,7 @@
           <w:b w:val="0"/>
           <w:sz w:val="17"/>
         </w:rPr>
-        <w:t>• Identified a critical observability gap in which major incidents were frequently detected through customer call centers rather than monitoring systems. Conceived, designed, and led adoption of RITHM, an operational intelligence platform that aggregated monitoring signals by business capability and ownership, reducing major incident detection times from hours to minutes.</w:t>
+        <w:t>• Secured executive sponsorship and expanded initial Splunk-based prototypes into a scalable Kafka and Elastic Stack solution, modernizing enterprise monitoring in alignment with open-source strategy.</w:t>
       </w:r>
     </w:p>
     <w:p>
@@ -537,7 +592,7 @@
           <w:b w:val="0"/>
           <w:sz w:val="17"/>
         </w:rPr>
-        <w:t>• Secured executive sponsorship and partnered with CTO-level leadership to modernize enterprise monitoring strategy, expanding Splunk prototypes into Kafka and Elastic Stack platforms adopted across the organization. Recognized with the Capital One Business Innovation Award for contributions to operational intelligence and monitoring transformation.</w:t>
+        <w:t>• Partnered with CTO-level leadership to define enterprise monitoring strategy, operational health metrics, and reliability-improvement initiatives, driving cross-functional alignment and operational excellence.</w:t>
       </w:r>
     </w:p>
     <w:p>
@@ -572,7 +627,7 @@
           <w:b w:val="0"/>
           <w:sz w:val="17"/>
         </w:rPr>
-        <w:t>• Led systems engineering teams of 40-50 engineers specializing in modeling, simulation, and advanced aerospace systems, providing technical leadership and risk management for programs valued up to $50M. Turned around an over-budget classified fixed-price technology program, delivering under budget and nearly doubling profit targets.</w:t>
+        <w:t>• Led systems engineering organizations of 40-50 engineers specializing in modeling, simulation, analysis, and advanced aerospace systems, providing technical leadership, career development, and proposal support for programs valued up to $50M.</w:t>
       </w:r>
     </w:p>
     <w:p>
@@ -586,7 +641,7 @@
           <w:b w:val="0"/>
           <w:sz w:val="17"/>
         </w:rPr>
-        <w:t>• Served as Principal Investigator for advanced radar resource-management systems, leading research, simulation, flight testing, and operational deployment across multiple aircraft programs. Developed patented fuzzy-logic scheduling technology deployed on major Department of Defense aircraft platforms.</w:t>
+        <w:t>• Turned around an over-budget classified fixed-price technology program by establishing execution plans, aligning engineering teams, and proactively managing technical and program risks; delivered under budget and nearly doubled the original profit target on a historically challenging delivery effort.</w:t>
       </w:r>
     </w:p>
     <w:p>
@@ -600,32 +655,6 @@
           <w:sz w:val="18"/>
         </w:rPr>
         <w:t>ADDITIONAL EXPERIENCE</w:t>
-      </w:r>
-    </w:p>
-    <w:p>
-      <w:pPr>
-        <w:spacing w:after="20"/>
-      </w:pPr>
-      <w:r>
-        <w:rPr>
-          <w:rFonts w:ascii="Arial" w:hAnsi="Arial" w:eastAsia="Arial"/>
-          <w:b w:val="0"/>
-          <w:sz w:val="17"/>
-        </w:rPr>
-        <w:t>Data Scientist | Intuit | Apr 2025 - Jul 2025</w:t>
-      </w:r>
-    </w:p>
-    <w:p>
-      <w:pPr>
-        <w:spacing w:after="20"/>
-      </w:pPr>
-      <w:r>
-        <w:rPr>
-          <w:rFonts w:ascii="Arial" w:hAnsi="Arial" w:eastAsia="Arial"/>
-          <w:b w:val="0"/>
-          <w:sz w:val="17"/>
-        </w:rPr>
-        <w:t>SEO Solutions Architect | Nike | Nov 2016 - Sep 2017</w:t>
       </w:r>
     </w:p>
     <w:p>
@@ -651,7 +680,7 @@
           <w:b/>
           <w:sz w:val="17"/>
         </w:rPr>
-        <w:t>GraphRAG Engine &amp; LoRA Coverage Assistant</w:t>
+        <w:t>GraphRAG Engine &amp; LoRA Coverage Assistant | GitHub | 2025</w:t>
       </w:r>
     </w:p>
     <w:p>
@@ -665,20 +694,7 @@
           <w:b w:val="0"/>
           <w:sz w:val="17"/>
         </w:rPr>
-        <w:t>• Built a GraphRAG system for multi-hop benefits reasoning with traceable retrieval paths across entities, clauses, and supporting evidence.</w:t>
-      </w:r>
-    </w:p>
-    <w:p>
-      <w:pPr>
-        <w:spacing w:after="20"/>
-      </w:pPr>
-      <w:r>
-        <w:rPr>
-          <w:rFonts w:ascii="Arial" w:hAnsi="Arial" w:eastAsia="Arial"/>
-          <w:b/>
-          <w:sz w:val="17"/>
-        </w:rPr>
-        <w:t>MCP / Agentic Workflow Demos</w:t>
+        <w:t>• Built a GraphRAG system for multi-hop benefits reasoning with fully traceable retrieval paths across entities, clauses, and supporting evidence.</w:t>
       </w:r>
     </w:p>
     <w:p>
@@ -692,7 +708,89 @@
           <w:b w:val="0"/>
           <w:sz w:val="17"/>
         </w:rPr>
-        <w:t>• Developed hands-on MCP and agentic workflow demos illustrating tool orchestration, structured outputs, traceability, and evaluation patterns.</w:t>
+        <w:t>• Fine-tuned a LoRA adapter on a 7B open-source LLM to enforce a strict JSON schema (decision/reason/disclaimer) for reliable downstream automation.</w:t>
+      </w:r>
+    </w:p>
+    <w:p>
+      <w:pPr>
+        <w:spacing w:after="20"/>
+      </w:pPr>
+      <w:r>
+        <w:rPr>
+          <w:rFonts w:ascii="Arial" w:hAnsi="Arial" w:eastAsia="Arial"/>
+          <w:b/>
+          <w:sz w:val="17"/>
+        </w:rPr>
+        <w:t>Agent-to-Agent Protocol MVPs | GitHub | 2026</w:t>
+      </w:r>
+    </w:p>
+    <w:p>
+      <w:pPr>
+        <w:spacing w:after="30"/>
+        <w:ind w:left="230" w:hanging="230"/>
+      </w:pPr>
+      <w:r>
+        <w:rPr>
+          <w:rFonts w:ascii="Arial" w:hAnsi="Arial" w:eastAsia="Arial"/>
+          <w:b w:val="0"/>
+          <w:sz w:val="17"/>
+        </w:rPr>
+        <w:t>• Agent Olympics: built a small evaluation runner that benchmarks a generalist agent vs discovered specialists across three task categories with explicit scoring criteria and summary reporting.</w:t>
+      </w:r>
+    </w:p>
+    <w:p>
+      <w:pPr>
+        <w:spacing w:after="30"/>
+        <w:ind w:left="230" w:hanging="230"/>
+      </w:pPr>
+      <w:r>
+        <w:rPr>
+          <w:rFonts w:ascii="Arial" w:hAnsi="Arial" w:eastAsia="Arial"/>
+          <w:b w:val="0"/>
+          <w:sz w:val="17"/>
+        </w:rPr>
+        <w:t>• AI PEMDAS: built an instrumented coordination workflow where an evaluator routes sub-steps to ADD vs MULT agents and logs calls for end-to-end traceability (FastAPI JSON-RPC).</w:t>
+      </w:r>
+    </w:p>
+    <w:p>
+      <w:pPr>
+        <w:spacing w:after="20"/>
+      </w:pPr>
+      <w:r>
+        <w:rPr>
+          <w:rFonts w:ascii="Arial" w:hAnsi="Arial" w:eastAsia="Arial"/>
+          <w:b/>
+          <w:sz w:val="17"/>
+        </w:rPr>
+        <w:t>Agentic Multimodal Orchestrator | GitHub | 2025</w:t>
+      </w:r>
+    </w:p>
+    <w:p>
+      <w:pPr>
+        <w:spacing w:after="30"/>
+        <w:ind w:left="230" w:hanging="230"/>
+      </w:pPr>
+      <w:r>
+        <w:rPr>
+          <w:rFonts w:ascii="Arial" w:hAnsi="Arial" w:eastAsia="Arial"/>
+          <w:b w:val="0"/>
+          <w:sz w:val="17"/>
+        </w:rPr>
+        <w:t>• Orchestrated structured retrieval, layout planning, and diffusion prompting to generate data-driven posters/maps with repeatable, template-based workflows.</w:t>
+      </w:r>
+    </w:p>
+    <w:p>
+      <w:pPr>
+        <w:spacing w:after="30"/>
+        <w:ind w:left="230" w:hanging="230"/>
+      </w:pPr>
+      <w:r>
+        <w:rPr>
+          <w:rFonts w:ascii="Arial" w:hAnsi="Arial" w:eastAsia="Arial"/>
+          <w:b w:val="0"/>
+          <w:sz w:val="17"/>
+        </w:rPr>
+        <w:t>• Implemented template constraints and parameterized prompts to ensure consistency across runs.</w:t>
       </w:r>
     </w:p>
     <w:p>
@@ -715,7 +813,6 @@
           <w:b w:val="0"/>
           <w:sz w:val="16"/>
         </w:rPr>
-        <w:t>MBA, UCLA Anderson | MS, Applied Statistics, Rochester Institute of Technology | MS, Electrical Engineering, University of Washington | BS, Physics, Humboldt State University</w:t>
       </w:r>
     </w:p>
     <w:p>
@@ -729,34 +826,6 @@
           <w:sz w:val="18"/>
         </w:rPr>
         <w:t>HONORS &amp; AWARDS</w:t>
-      </w:r>
-    </w:p>
-    <w:p>
-      <w:pPr>
-        <w:spacing w:after="30"/>
-        <w:ind w:left="230" w:hanging="230"/>
-      </w:pPr>
-      <w:r>
-        <w:rPr>
-          <w:rFonts w:ascii="Arial" w:hAnsi="Arial" w:eastAsia="Arial"/>
-          <w:b w:val="0"/>
-          <w:sz w:val="17"/>
-        </w:rPr>
-        <w:t>• Lead inventor, U.S. Patent 8,635,622, Method and system for resource management using fuzzy logic timeline filling</w:t>
-      </w:r>
-    </w:p>
-    <w:p>
-      <w:pPr>
-        <w:spacing w:after="30"/>
-        <w:ind w:left="230" w:hanging="230"/>
-      </w:pPr>
-      <w:r>
-        <w:rPr>
-          <w:rFonts w:ascii="Arial" w:hAnsi="Arial" w:eastAsia="Arial"/>
-          <w:b w:val="0"/>
-          <w:sz w:val="17"/>
-        </w:rPr>
-        <w:t>• Capital One Business Technology Innovation Award</w:t>
       </w:r>
     </w:p>
     <w:sectPr>

</xml_diff>